<commit_message>
ENT-1.3 : trame élève remise en page (plus de place pour répondre) et bandeau de fin de séance cité
Écrit par Cowork, validé par Tristan.

Co-Authored-By: Claude Opus 5.5 <noreply@anthropic.com>
</commit_message>
<xml_diff>
--- a/contenus/trames/ENT-1.3-spartoo-tracabilite-trame-eleve.docx
+++ b/contenus/trames/ENT-1.3-spartoo-tracabilite-trame-eleve.docx
@@ -989,109 +989,87 @@
       <w:tblPr>
         <w:tblStyle w:val="TableGrid"/>
         <w:tblW w:type="auto" w:w="0"/>
-        <w:tblLayout w:type="fixed"/>
         <w:tblLook w:firstColumn="1" w:firstRow="1" w:lastColumn="0" w:lastRow="0" w:noHBand="0" w:noVBand="1" w:val="04A0"/>
       </w:tblPr>
       <w:tblGrid>
-        <w:gridCol w:w="5896"/>
-        <w:gridCol w:w="3742"/>
+        <w:gridCol w:w="10086"/>
       </w:tblGrid>
       <w:tr>
+        <w:trPr>
+          <w:cantSplit/>
+          <w:trHeight w:val="1474"/>
+        </w:trPr>
         <w:tc>
           <w:tcPr>
-            <w:tcW w:type="dxa" w:w="5896"/>
-            <w:shd w:fill="E8E8E8"/>
+            <w:tcW w:type="dxa" w:w="10086"/>
+            <w:shd w:fill="FAFAFA"/>
           </w:tcPr>
           <w:p>
             <w:pPr>
-              <w:keepNext/>
-              <w:spacing w:after="0"/>
+              <w:spacing w:after="80"/>
             </w:pPr>
             <w:r>
               <w:rPr>
                 <w:b/>
-                <w:color w:val="111111"/>
-                <w:sz w:val="20"/>
+                <w:sz w:val="21"/>
               </w:rPr>
-              <w:t>Question</w:t>
+              <w:t>Qu'est-ce qu'un numéro de lot ?</w:t>
             </w:r>
           </w:p>
-        </w:tc>
-        <w:tc>
-          <w:tcPr>
-            <w:tcW w:type="dxa" w:w="3742"/>
-            <w:shd w:fill="E8E8E8"/>
-          </w:tcPr>
           <w:p>
             <w:pPr>
-              <w:keepNext/>
-              <w:spacing w:after="0"/>
+              <w:spacing w:before="0" w:after="80"/>
             </w:pPr>
             <w:r>
               <w:rPr>
-                <w:b/>
-                <w:color w:val="111111"/>
-                <w:sz w:val="20"/>
+                <w:sz w:val="22"/>
               </w:rPr>
-              <w:t>Ta réponse</w:t>
+            </w:r>
+          </w:p>
+          <w:p>
+            <w:pPr>
+              <w:spacing w:before="0" w:after="80"/>
+            </w:pPr>
+            <w:r>
+              <w:rPr>
+                <w:sz w:val="22"/>
+              </w:rPr>
             </w:r>
           </w:p>
         </w:tc>
       </w:tr>
       <w:tr>
         <w:trPr>
-          <w:trHeight w:val="510"/>
           <w:cantSplit/>
+          <w:trHeight w:val="992"/>
         </w:trPr>
         <w:tc>
           <w:tcPr>
-            <w:tcW w:type="dxa" w:w="5896"/>
+            <w:tcW w:type="dxa" w:w="10086"/>
+            <w:shd w:fill="FAFAFA"/>
           </w:tcPr>
           <w:p>
             <w:pPr>
-              <w:spacing w:after="0"/>
+              <w:spacing w:after="80"/>
             </w:pPr>
             <w:r>
               <w:rPr>
-                <w:sz w:val="20"/>
-              </w:rPr>
-              <w:t>Qu'est-ce qu'un numéro de lot ?</w:t>
-            </w:r>
-          </w:p>
-        </w:tc>
-        <w:tc>
-          <w:tcPr>
-            <w:tcW w:type="dxa" w:w="3742"/>
-          </w:tcPr>
-          <w:p/>
-        </w:tc>
-      </w:tr>
-      <w:tr>
-        <w:trPr>
-          <w:trHeight w:val="510"/>
-          <w:cantSplit/>
-        </w:trPr>
-        <w:tc>
-          <w:tcPr>
-            <w:tcW w:type="dxa" w:w="5896"/>
-          </w:tcPr>
-          <w:p>
-            <w:pPr>
-              <w:spacing w:after="0"/>
-            </w:pPr>
-            <w:r>
-              <w:rPr>
-                <w:sz w:val="20"/>
+                <w:b/>
+                <w:sz w:val="21"/>
               </w:rPr>
               <w:t>Qui attribue le numéro de lot ?</w:t>
             </w:r>
           </w:p>
-        </w:tc>
-        <w:tc>
-          <w:tcPr>
-            <w:tcW w:type="dxa" w:w="3742"/>
-          </w:tcPr>
-          <w:p/>
+          <w:p>
+            <w:pPr>
+              <w:spacing w:before="0" w:after="80"/>
+            </w:pPr>
+            <w:r>
+              <w:rPr>
+                <w:sz w:val="22"/>
+              </w:rPr>
+            </w:r>
+          </w:p>
         </w:tc>
       </w:tr>
     </w:tbl>
@@ -1614,13 +1592,13 @@
         <w:tblLook w:firstColumn="1" w:firstRow="1" w:lastColumn="0" w:lastRow="0" w:noHBand="0" w:noVBand="1" w:val="04A0"/>
       </w:tblPr>
       <w:tblGrid>
-        <w:gridCol w:w="5896"/>
-        <w:gridCol w:w="3742"/>
+        <w:gridCol w:w="4195"/>
+        <w:gridCol w:w="5443"/>
       </w:tblGrid>
       <w:tr>
         <w:tc>
           <w:tcPr>
-            <w:tcW w:type="dxa" w:w="5896"/>
+            <w:tcW w:type="dxa" w:w="4195"/>
             <w:shd w:fill="E8E8E8"/>
           </w:tcPr>
           <w:p>
@@ -1640,7 +1618,7 @@
         </w:tc>
         <w:tc>
           <w:tcPr>
-            <w:tcW w:type="dxa" w:w="3742"/>
+            <w:tcW w:type="dxa" w:w="5443"/>
             <w:shd w:fill="E8E8E8"/>
           </w:tcPr>
           <w:p>
@@ -1661,12 +1639,12 @@
       </w:tr>
       <w:tr>
         <w:trPr>
-          <w:trHeight w:val="510"/>
+          <w:trHeight w:val="737"/>
           <w:cantSplit/>
         </w:trPr>
         <w:tc>
           <w:tcPr>
-            <w:tcW w:type="dxa" w:w="5896"/>
+            <w:tcW w:type="dxa" w:w="4195"/>
           </w:tcPr>
           <w:p>
             <w:pPr>
@@ -1682,7 +1660,7 @@
         </w:tc>
         <w:tc>
           <w:tcPr>
-            <w:tcW w:type="dxa" w:w="3742"/>
+            <w:tcW w:type="dxa" w:w="5443"/>
           </w:tcPr>
           <w:p/>
         </w:tc>
@@ -2968,13 +2946,13 @@
         <w:tblLook w:firstColumn="1" w:firstRow="1" w:lastColumn="0" w:lastRow="0" w:noHBand="0" w:noVBand="1" w:val="04A0"/>
       </w:tblPr>
       <w:tblGrid>
-        <w:gridCol w:w="5896"/>
-        <w:gridCol w:w="3742"/>
+        <w:gridCol w:w="4195"/>
+        <w:gridCol w:w="5443"/>
       </w:tblGrid>
       <w:tr>
         <w:tc>
           <w:tcPr>
-            <w:tcW w:type="dxa" w:w="5896"/>
+            <w:tcW w:type="dxa" w:w="4195"/>
             <w:shd w:fill="E8E8E8"/>
           </w:tcPr>
           <w:p>
@@ -2994,7 +2972,7 @@
         </w:tc>
         <w:tc>
           <w:tcPr>
-            <w:tcW w:type="dxa" w:w="3742"/>
+            <w:tcW w:type="dxa" w:w="5443"/>
             <w:shd w:fill="E8E8E8"/>
           </w:tcPr>
           <w:p>
@@ -3015,12 +2993,12 @@
       </w:tr>
       <w:tr>
         <w:trPr>
-          <w:trHeight w:val="510"/>
+          <w:trHeight w:val="737"/>
           <w:cantSplit/>
         </w:trPr>
         <w:tc>
           <w:tcPr>
-            <w:tcW w:type="dxa" w:w="5896"/>
+            <w:tcW w:type="dxa" w:w="4195"/>
           </w:tcPr>
           <w:p>
             <w:pPr>
@@ -3036,7 +3014,7 @@
         </w:tc>
         <w:tc>
           <w:tcPr>
-            <w:tcW w:type="dxa" w:w="3742"/>
+            <w:tcW w:type="dxa" w:w="5443"/>
           </w:tcPr>
           <w:p/>
         </w:tc>
@@ -3593,13 +3571,13 @@
         <w:tblLook w:firstColumn="1" w:firstRow="1" w:lastColumn="0" w:lastRow="0" w:noHBand="0" w:noVBand="1" w:val="04A0"/>
       </w:tblPr>
       <w:tblGrid>
-        <w:gridCol w:w="5896"/>
-        <w:gridCol w:w="3742"/>
+        <w:gridCol w:w="4195"/>
+        <w:gridCol w:w="5443"/>
       </w:tblGrid>
       <w:tr>
         <w:tc>
           <w:tcPr>
-            <w:tcW w:type="dxa" w:w="5896"/>
+            <w:tcW w:type="dxa" w:w="4195"/>
             <w:shd w:fill="E8E8E8"/>
           </w:tcPr>
           <w:p>
@@ -3619,7 +3597,7 @@
         </w:tc>
         <w:tc>
           <w:tcPr>
-            <w:tcW w:type="dxa" w:w="3742"/>
+            <w:tcW w:type="dxa" w:w="5443"/>
             <w:shd w:fill="E8E8E8"/>
           </w:tcPr>
           <w:p>
@@ -3640,12 +3618,12 @@
       </w:tr>
       <w:tr>
         <w:trPr>
-          <w:trHeight w:val="510"/>
+          <w:trHeight w:val="737"/>
           <w:cantSplit/>
         </w:trPr>
         <w:tc>
           <w:tcPr>
-            <w:tcW w:type="dxa" w:w="5896"/>
+            <w:tcW w:type="dxa" w:w="4195"/>
           </w:tcPr>
           <w:p>
             <w:pPr>
@@ -3661,19 +3639,19 @@
         </w:tc>
         <w:tc>
           <w:tcPr>
-            <w:tcW w:type="dxa" w:w="3742"/>
+            <w:tcW w:type="dxa" w:w="5443"/>
           </w:tcPr>
           <w:p/>
         </w:tc>
       </w:tr>
       <w:tr>
         <w:trPr>
-          <w:trHeight w:val="510"/>
+          <w:trHeight w:val="737"/>
           <w:cantSplit/>
         </w:trPr>
         <w:tc>
           <w:tcPr>
-            <w:tcW w:type="dxa" w:w="5896"/>
+            <w:tcW w:type="dxa" w:w="4195"/>
           </w:tcPr>
           <w:p>
             <w:pPr>
@@ -3689,7 +3667,7 @@
         </w:tc>
         <w:tc>
           <w:tcPr>
-            <w:tcW w:type="dxa" w:w="3742"/>
+            <w:tcW w:type="dxa" w:w="5443"/>
           </w:tcPr>
           <w:p/>
         </w:tc>
@@ -4191,13 +4169,13 @@
         <w:tblLook w:firstColumn="1" w:firstRow="1" w:lastColumn="0" w:lastRow="0" w:noHBand="0" w:noVBand="1" w:val="04A0"/>
       </w:tblPr>
       <w:tblGrid>
-        <w:gridCol w:w="5896"/>
-        <w:gridCol w:w="3742"/>
+        <w:gridCol w:w="4195"/>
+        <w:gridCol w:w="5443"/>
       </w:tblGrid>
       <w:tr>
         <w:tc>
           <w:tcPr>
-            <w:tcW w:type="dxa" w:w="5896"/>
+            <w:tcW w:type="dxa" w:w="4195"/>
             <w:shd w:fill="E8E8E8"/>
           </w:tcPr>
           <w:p>
@@ -4217,7 +4195,7 @@
         </w:tc>
         <w:tc>
           <w:tcPr>
-            <w:tcW w:type="dxa" w:w="3742"/>
+            <w:tcW w:type="dxa" w:w="5443"/>
             <w:shd w:fill="E8E8E8"/>
           </w:tcPr>
           <w:p>
@@ -4238,12 +4216,12 @@
       </w:tr>
       <w:tr>
         <w:trPr>
-          <w:trHeight w:val="510"/>
+          <w:trHeight w:val="737"/>
           <w:cantSplit/>
         </w:trPr>
         <w:tc>
           <w:tcPr>
-            <w:tcW w:type="dxa" w:w="5896"/>
+            <w:tcW w:type="dxa" w:w="4195"/>
           </w:tcPr>
           <w:p>
             <w:pPr>
@@ -4259,7 +4237,7 @@
         </w:tc>
         <w:tc>
           <w:tcPr>
-            <w:tcW w:type="dxa" w:w="3742"/>
+            <w:tcW w:type="dxa" w:w="5443"/>
           </w:tcPr>
           <w:p/>
         </w:tc>
@@ -4715,6 +4693,19 @@
                 <w:sz w:val="20"/>
               </w:rPr>
               <w:t>•  ton compte rendu est envoyé, en réponse au message de M. Morin ;</w:t>
+            </w:r>
+          </w:p>
+          <w:p>
+            <w:pPr>
+              <w:keepNext/>
+              <w:spacing w:before="0" w:after="40"/>
+              <w:ind w:left="397" w:hanging="227"/>
+            </w:pPr>
+            <w:r>
+              <w:rPr>
+                <w:sz w:val="20"/>
+              </w:rPr>
+              <w:t>•  un bandeau s'affiche en haut de l'écran : « Séance validée ✓ », ou bien le titre de ce qui reste à corriger (dans ce cas, appelle ton professeur) ;</w:t>
             </w:r>
           </w:p>
           <w:p>

</xml_diff>